<commit_message>
docs: ZP-DOC-00..04 approved by the product owner (v1.0, baselined)
Praveen approved the documentation set on 5 Oct 2026. Each document moves to
version 1.0, status Approved, with a revision-history row and the approval
table filled (approver, "approved in writing", date). Builder now renders the
signature and date from front matter. README index shows the new status.

Co-Authored-By: Claude Opus 5.5 (1M context) <noreply@anthropic.com>
</commit_message>
<xml_diff>
--- a/docs/00-documentation-standard/ZP-DOC-00_Documentation-Standard.docx
+++ b/docs/00-documentation-standard/ZP-DOC-00_Documentation-Standard.docx
@@ -90,7 +90,7 @@
           <w:left w:w="10" w:type="dxa"/>
           <w:right w:w="10" w:type="dxa"/>
         </w:tblCellMar>
-        <w:tblLook w:val="04A0" w:firstRow="1" w:lastRow="0" w:firstColumn="1" w:lastColumn="0" w:noHBand="0" w:noVBand="1"/>
+        <w:tblLook w:val="0000" w:firstRow="0" w:lastRow="0" w:firstColumn="0" w:lastColumn="0" w:noHBand="0" w:noVBand="0"/>
       </w:tblPr>
       <w:tblGrid>
         <w:gridCol w:w="2600"/>
@@ -157,7 +157,7 @@
                 <w:sz w:val="19"/>
                 <w:szCs w:val="19"/>
               </w:rPr>
-              <w:t>0.9</w:t>
+              <w:t>1.0</w:t>
             </w:r>
           </w:p>
         </w:tc>
@@ -223,7 +223,7 @@
                 <w:sz w:val="19"/>
                 <w:szCs w:val="19"/>
               </w:rPr>
-              <w:t>In review</w:t>
+              <w:t>Approved</w:t>
             </w:r>
           </w:p>
         </w:tc>
@@ -494,7 +494,7 @@
           <w:left w:w="10" w:type="dxa"/>
           <w:right w:w="10" w:type="dxa"/>
         </w:tblCellMar>
-        <w:tblLook w:val="04A0" w:firstRow="1" w:lastRow="0" w:firstColumn="1" w:lastColumn="0" w:noHBand="0" w:noVBand="1"/>
+        <w:tblLook w:val="0000" w:firstRow="0" w:lastRow="0" w:firstColumn="0" w:lastColumn="0" w:noHBand="0" w:noVBand="0"/>
       </w:tblPr>
       <w:tblGrid>
         <w:gridCol w:w="2600"/>
@@ -693,7 +693,7 @@
                 <w:sz w:val="19"/>
                 <w:szCs w:val="19"/>
               </w:rPr>
-              <w:t>0.9</w:t>
+              <w:t>1.0</w:t>
             </w:r>
           </w:p>
         </w:tc>
@@ -759,7 +759,7 @@
                 <w:sz w:val="19"/>
                 <w:szCs w:val="19"/>
               </w:rPr>
-              <w:t>In review</w:t>
+              <w:t>Approved</w:t>
             </w:r>
           </w:p>
         </w:tc>
@@ -1189,7 +1189,7 @@
           <w:left w:w="10" w:type="dxa"/>
           <w:right w:w="10" w:type="dxa"/>
         </w:tblCellMar>
-        <w:tblLook w:val="04A0" w:firstRow="1" w:lastRow="0" w:firstColumn="1" w:lastColumn="0" w:noHBand="0" w:noVBand="1"/>
+        <w:tblLook w:val="0000" w:firstRow="0" w:lastRow="0" w:firstColumn="0" w:lastColumn="0" w:noHBand="0" w:noVBand="0"/>
       </w:tblPr>
       <w:tblGrid>
         <w:gridCol w:w="964"/>
@@ -1444,6 +1444,122 @@
           </w:p>
         </w:tc>
       </w:tr>
+      <w:tr>
+        <w:tblPrEx>
+          <w:tblCellMar>
+            <w:top w:w="0" w:type="dxa"/>
+            <w:bottom w:w="0" w:type="dxa"/>
+          </w:tblCellMar>
+        </w:tblPrEx>
+        <w:trPr>
+          <w:cantSplit/>
+          <w:trHeight w:val="420"/>
+        </w:trPr>
+        <w:tc>
+          <w:tcPr>
+            <w:tcW w:w="964" w:type="dxa"/>
+            <w:tcBorders>
+              <w:top w:val="single" w:sz="4" w:space="0" w:color="C9D3D0"/>
+              <w:left w:val="single" w:sz="4" w:space="0" w:color="C9D3D0"/>
+              <w:bottom w:val="single" w:sz="4" w:space="0" w:color="C9D3D0"/>
+              <w:right w:val="single" w:sz="4" w:space="0" w:color="C9D3D0"/>
+            </w:tcBorders>
+            <w:tcMar>
+              <w:top w:w="50" w:type="dxa"/>
+              <w:left w:w="100" w:type="dxa"/>
+              <w:bottom w:w="50" w:type="dxa"/>
+              <w:right w:w="100" w:type="dxa"/>
+            </w:tcMar>
+          </w:tcPr>
+          <w:p>
+            <w:r>
+              <w:rPr>
+                <w:sz w:val="19"/>
+                <w:szCs w:val="19"/>
+              </w:rPr>
+              <w:t>1.0</w:t>
+            </w:r>
+          </w:p>
+        </w:tc>
+        <w:tc>
+          <w:tcPr>
+            <w:tcW w:w="1542" w:type="dxa"/>
+            <w:tcBorders>
+              <w:top w:val="single" w:sz="4" w:space="0" w:color="C9D3D0"/>
+              <w:left w:val="single" w:sz="4" w:space="0" w:color="C9D3D0"/>
+              <w:bottom w:val="single" w:sz="4" w:space="0" w:color="C9D3D0"/>
+              <w:right w:val="single" w:sz="4" w:space="0" w:color="C9D3D0"/>
+            </w:tcBorders>
+            <w:tcMar>
+              <w:top w:w="50" w:type="dxa"/>
+              <w:left w:w="100" w:type="dxa"/>
+              <w:bottom w:w="50" w:type="dxa"/>
+              <w:right w:w="100" w:type="dxa"/>
+            </w:tcMar>
+          </w:tcPr>
+          <w:p>
+            <w:r>
+              <w:rPr>
+                <w:sz w:val="19"/>
+                <w:szCs w:val="19"/>
+              </w:rPr>
+              <w:t>5 Oct 2026</w:t>
+            </w:r>
+          </w:p>
+        </w:tc>
+        <w:tc>
+          <w:tcPr>
+            <w:tcW w:w="1928" w:type="dxa"/>
+            <w:tcBorders>
+              <w:top w:val="single" w:sz="4" w:space="0" w:color="C9D3D0"/>
+              <w:left w:val="single" w:sz="4" w:space="0" w:color="C9D3D0"/>
+              <w:bottom w:val="single" w:sz="4" w:space="0" w:color="C9D3D0"/>
+              <w:right w:val="single" w:sz="4" w:space="0" w:color="C9D3D0"/>
+            </w:tcBorders>
+            <w:tcMar>
+              <w:top w:w="50" w:type="dxa"/>
+              <w:left w:w="100" w:type="dxa"/>
+              <w:bottom w:w="50" w:type="dxa"/>
+              <w:right w:w="100" w:type="dxa"/>
+            </w:tcMar>
+          </w:tcPr>
+          <w:p>
+            <w:r>
+              <w:rPr>
+                <w:sz w:val="19"/>
+                <w:szCs w:val="19"/>
+              </w:rPr>
+              <w:t>B.M.P Banneka</w:t>
+            </w:r>
+          </w:p>
+        </w:tc>
+        <w:tc>
+          <w:tcPr>
+            <w:tcW w:w="5204" w:type="dxa"/>
+            <w:tcBorders>
+              <w:top w:val="single" w:sz="4" w:space="0" w:color="C9D3D0"/>
+              <w:left w:val="single" w:sz="4" w:space="0" w:color="C9D3D0"/>
+              <w:bottom w:val="single" w:sz="4" w:space="0" w:color="C9D3D0"/>
+              <w:right w:val="single" w:sz="4" w:space="0" w:color="C9D3D0"/>
+            </w:tcBorders>
+            <w:tcMar>
+              <w:top w:w="50" w:type="dxa"/>
+              <w:left w:w="100" w:type="dxa"/>
+              <w:bottom w:w="50" w:type="dxa"/>
+              <w:right w:w="100" w:type="dxa"/>
+            </w:tcMar>
+          </w:tcPr>
+          <w:p>
+            <w:r>
+              <w:rPr>
+                <w:sz w:val="19"/>
+                <w:szCs w:val="19"/>
+              </w:rPr>
+              <w:t>Approved by the product owner; baselined</w:t>
+            </w:r>
+          </w:p>
+        </w:tc>
+      </w:tr>
     </w:tbl>
     <w:p>
       <w:pPr>
@@ -1486,7 +1602,7 @@
           <w:left w:w="10" w:type="dxa"/>
           <w:right w:w="10" w:type="dxa"/>
         </w:tblCellMar>
-        <w:tblLook w:val="04A0" w:firstRow="1" w:lastRow="0" w:firstColumn="1" w:lastColumn="0" w:noHBand="0" w:noVBand="1"/>
+        <w:tblLook w:val="0000" w:firstRow="0" w:lastRow="0" w:firstColumn="0" w:lastColumn="0" w:noHBand="0" w:noVBand="0"/>
       </w:tblPr>
       <w:tblGrid>
         <w:gridCol w:w="2120"/>
@@ -1804,7 +1920,15 @@
               <w:right w:w="100" w:type="dxa"/>
             </w:tcMar>
           </w:tcPr>
-          <w:p/>
+          <w:p>
+            <w:r>
+              <w:rPr>
+                <w:sz w:val="19"/>
+                <w:szCs w:val="19"/>
+              </w:rPr>
+              <w:t>Approved in writing (project channel)</w:t>
+            </w:r>
+          </w:p>
         </w:tc>
         <w:tc>
           <w:tcPr>
@@ -1822,7 +1946,15 @@
               <w:right w:w="100" w:type="dxa"/>
             </w:tcMar>
           </w:tcPr>
-          <w:p/>
+          <w:p>
+            <w:r>
+              <w:rPr>
+                <w:sz w:val="19"/>
+                <w:szCs w:val="19"/>
+              </w:rPr>
+              <w:t>5 Oct 2026</w:t>
+            </w:r>
+          </w:p>
         </w:tc>
       </w:tr>
     </w:tbl>
@@ -1843,7 +1975,7 @@
     <w:sdt>
       <w:sdtPr>
         <w:alias w:val="Contents"/>
-        <w:id w:val="2046476300"/>
+        <w:id w:val="-1434428444"/>
       </w:sdtPr>
       <w:sdtEndPr/>
       <w:sdtContent>
@@ -1872,7 +2004,7 @@
           <w:r>
             <w:fldChar w:fldCharType="separate"/>
           </w:r>
-          <w:hyperlink w:anchor="_Toc242095328" w:history="1">
+          <w:hyperlink w:anchor="_Toc242097209" w:history="1">
             <w:r>
               <w:rPr>
                 <w:rStyle w:val="Hyperlink"/>
@@ -1896,7 +2028,7 @@
               <w:rPr>
                 <w:noProof/>
               </w:rPr>
-              <w:instrText xml:space="preserve"> PAGEREF _Toc242095328 \h </w:instrText>
+              <w:instrText xml:space="preserve"> PAGEREF _Toc242097209 \h </w:instrText>
             </w:r>
             <w:r>
               <w:rPr>
@@ -1939,7 +2071,7 @@
               <w14:ligatures w14:val="standardContextual"/>
             </w:rPr>
           </w:pPr>
-          <w:hyperlink w:anchor="_Toc242095329" w:history="1">
+          <w:hyperlink w:anchor="_Toc242097210" w:history="1">
             <w:r>
               <w:rPr>
                 <w:rStyle w:val="Hyperlink"/>
@@ -1963,7 +2095,7 @@
               <w:rPr>
                 <w:noProof/>
               </w:rPr>
-              <w:instrText xml:space="preserve"> PAGEREF _Toc242095329 \h </w:instrText>
+              <w:instrText xml:space="preserve"> PAGEREF _Toc242097210 \h </w:instrText>
             </w:r>
             <w:r>
               <w:rPr>
@@ -2006,7 +2138,7 @@
               <w14:ligatures w14:val="standardContextual"/>
             </w:rPr>
           </w:pPr>
-          <w:hyperlink w:anchor="_Toc242095330" w:history="1">
+          <w:hyperlink w:anchor="_Toc242097211" w:history="1">
             <w:r>
               <w:rPr>
                 <w:rStyle w:val="Hyperlink"/>
@@ -2030,7 +2162,7 @@
               <w:rPr>
                 <w:noProof/>
               </w:rPr>
-              <w:instrText xml:space="preserve"> PAGEREF _Toc242095330 \h </w:instrText>
+              <w:instrText xml:space="preserve"> PAGEREF _Toc242097211 \h </w:instrText>
             </w:r>
             <w:r>
               <w:rPr>
@@ -2073,7 +2205,7 @@
               <w14:ligatures w14:val="standardContextual"/>
             </w:rPr>
           </w:pPr>
-          <w:hyperlink w:anchor="_Toc242095331" w:history="1">
+          <w:hyperlink w:anchor="_Toc242097212" w:history="1">
             <w:r>
               <w:rPr>
                 <w:rStyle w:val="Hyperlink"/>
@@ -2097,7 +2229,7 @@
               <w:rPr>
                 <w:noProof/>
               </w:rPr>
-              <w:instrText xml:space="preserve"> PAGEREF _Toc242095331 \h </w:instrText>
+              <w:instrText xml:space="preserve"> PAGEREF _Toc242097212 \h </w:instrText>
             </w:r>
             <w:r>
               <w:rPr>
@@ -2140,7 +2272,7 @@
               <w14:ligatures w14:val="standardContextual"/>
             </w:rPr>
           </w:pPr>
-          <w:hyperlink w:anchor="_Toc242095332" w:history="1">
+          <w:hyperlink w:anchor="_Toc242097213" w:history="1">
             <w:r>
               <w:rPr>
                 <w:rStyle w:val="Hyperlink"/>
@@ -2164,7 +2296,7 @@
               <w:rPr>
                 <w:noProof/>
               </w:rPr>
-              <w:instrText xml:space="preserve"> PAGEREF _Toc242095332 \h </w:instrText>
+              <w:instrText xml:space="preserve"> PAGEREF _Toc242097213 \h </w:instrText>
             </w:r>
             <w:r>
               <w:rPr>
@@ -2207,7 +2339,7 @@
               <w14:ligatures w14:val="standardContextual"/>
             </w:rPr>
           </w:pPr>
-          <w:hyperlink w:anchor="_Toc242095333" w:history="1">
+          <w:hyperlink w:anchor="_Toc242097214" w:history="1">
             <w:r>
               <w:rPr>
                 <w:rStyle w:val="Hyperlink"/>
@@ -2231,7 +2363,7 @@
               <w:rPr>
                 <w:noProof/>
               </w:rPr>
-              <w:instrText xml:space="preserve"> PAGEREF _Toc242095333 \h </w:instrText>
+              <w:instrText xml:space="preserve"> PAGEREF _Toc242097214 \h </w:instrText>
             </w:r>
             <w:r>
               <w:rPr>
@@ -2274,7 +2406,7 @@
               <w14:ligatures w14:val="standardContextual"/>
             </w:rPr>
           </w:pPr>
-          <w:hyperlink w:anchor="_Toc242095334" w:history="1">
+          <w:hyperlink w:anchor="_Toc242097215" w:history="1">
             <w:r>
               <w:rPr>
                 <w:rStyle w:val="Hyperlink"/>
@@ -2298,7 +2430,7 @@
               <w:rPr>
                 <w:noProof/>
               </w:rPr>
-              <w:instrText xml:space="preserve"> PAGEREF _Toc242095334 \h </w:instrText>
+              <w:instrText xml:space="preserve"> PAGEREF _Toc242097215 \h </w:instrText>
             </w:r>
             <w:r>
               <w:rPr>
@@ -2341,7 +2473,7 @@
               <w14:ligatures w14:val="standardContextual"/>
             </w:rPr>
           </w:pPr>
-          <w:hyperlink w:anchor="_Toc242095335" w:history="1">
+          <w:hyperlink w:anchor="_Toc242097216" w:history="1">
             <w:r>
               <w:rPr>
                 <w:rStyle w:val="Hyperlink"/>
@@ -2365,7 +2497,7 @@
               <w:rPr>
                 <w:noProof/>
               </w:rPr>
-              <w:instrText xml:space="preserve"> PAGEREF _Toc242095335 \h </w:instrText>
+              <w:instrText xml:space="preserve"> PAGEREF _Toc242097216 \h </w:instrText>
             </w:r>
             <w:r>
               <w:rPr>
@@ -2408,7 +2540,7 @@
               <w14:ligatures w14:val="standardContextual"/>
             </w:rPr>
           </w:pPr>
-          <w:hyperlink w:anchor="_Toc242095336" w:history="1">
+          <w:hyperlink w:anchor="_Toc242097217" w:history="1">
             <w:r>
               <w:rPr>
                 <w:rStyle w:val="Hyperlink"/>
@@ -2432,7 +2564,7 @@
               <w:rPr>
                 <w:noProof/>
               </w:rPr>
-              <w:instrText xml:space="preserve"> PAGEREF _Toc242095336 \h </w:instrText>
+              <w:instrText xml:space="preserve"> PAGEREF _Toc242097217 \h </w:instrText>
             </w:r>
             <w:r>
               <w:rPr>
@@ -2475,7 +2607,7 @@
               <w14:ligatures w14:val="standardContextual"/>
             </w:rPr>
           </w:pPr>
-          <w:hyperlink w:anchor="_Toc242095337" w:history="1">
+          <w:hyperlink w:anchor="_Toc242097218" w:history="1">
             <w:r>
               <w:rPr>
                 <w:rStyle w:val="Hyperlink"/>
@@ -2499,7 +2631,7 @@
               <w:rPr>
                 <w:noProof/>
               </w:rPr>
-              <w:instrText xml:space="preserve"> PAGEREF _Toc242095337 \h </w:instrText>
+              <w:instrText xml:space="preserve"> PAGEREF _Toc242097218 \h </w:instrText>
             </w:r>
             <w:r>
               <w:rPr>
@@ -2542,7 +2674,7 @@
               <w14:ligatures w14:val="standardContextual"/>
             </w:rPr>
           </w:pPr>
-          <w:hyperlink w:anchor="_Toc242095338" w:history="1">
+          <w:hyperlink w:anchor="_Toc242097219" w:history="1">
             <w:r>
               <w:rPr>
                 <w:rStyle w:val="Hyperlink"/>
@@ -2566,7 +2698,7 @@
               <w:rPr>
                 <w:noProof/>
               </w:rPr>
-              <w:instrText xml:space="preserve"> PAGEREF _Toc242095338 \h </w:instrText>
+              <w:instrText xml:space="preserve"> PAGEREF _Toc242097219 \h </w:instrText>
             </w:r>
             <w:r>
               <w:rPr>
@@ -2609,7 +2741,7 @@
               <w14:ligatures w14:val="standardContextual"/>
             </w:rPr>
           </w:pPr>
-          <w:hyperlink w:anchor="_Toc242095339" w:history="1">
+          <w:hyperlink w:anchor="_Toc242097220" w:history="1">
             <w:r>
               <w:rPr>
                 <w:rStyle w:val="Hyperlink"/>
@@ -2633,7 +2765,7 @@
               <w:rPr>
                 <w:noProof/>
               </w:rPr>
-              <w:instrText xml:space="preserve"> PAGEREF _Toc242095339 \h </w:instrText>
+              <w:instrText xml:space="preserve"> PAGEREF _Toc242097220 \h </w:instrText>
             </w:r>
             <w:r>
               <w:rPr>
@@ -2676,7 +2808,7 @@
               <w14:ligatures w14:val="standardContextual"/>
             </w:rPr>
           </w:pPr>
-          <w:hyperlink w:anchor="_Toc242095340" w:history="1">
+          <w:hyperlink w:anchor="_Toc242097221" w:history="1">
             <w:r>
               <w:rPr>
                 <w:rStyle w:val="Hyperlink"/>
@@ -2700,7 +2832,7 @@
               <w:rPr>
                 <w:noProof/>
               </w:rPr>
-              <w:instrText xml:space="preserve"> PAGEREF _Toc242095340 \h </w:instrText>
+              <w:instrText xml:space="preserve"> PAGEREF _Toc242097221 \h </w:instrText>
             </w:r>
             <w:r>
               <w:rPr>
@@ -2743,7 +2875,7 @@
               <w14:ligatures w14:val="standardContextual"/>
             </w:rPr>
           </w:pPr>
-          <w:hyperlink w:anchor="_Toc242095341" w:history="1">
+          <w:hyperlink w:anchor="_Toc242097222" w:history="1">
             <w:r>
               <w:rPr>
                 <w:rStyle w:val="Hyperlink"/>
@@ -2767,7 +2899,7 @@
               <w:rPr>
                 <w:noProof/>
               </w:rPr>
-              <w:instrText xml:space="preserve"> PAGEREF _Toc242095341 \h </w:instrText>
+              <w:instrText xml:space="preserve"> PAGEREF _Toc242097222 \h </w:instrText>
             </w:r>
             <w:r>
               <w:rPr>
@@ -2810,7 +2942,7 @@
               <w14:ligatures w14:val="standardContextual"/>
             </w:rPr>
           </w:pPr>
-          <w:hyperlink w:anchor="_Toc242095342" w:history="1">
+          <w:hyperlink w:anchor="_Toc242097223" w:history="1">
             <w:r>
               <w:rPr>
                 <w:rStyle w:val="Hyperlink"/>
@@ -2834,7 +2966,7 @@
               <w:rPr>
                 <w:noProof/>
               </w:rPr>
-              <w:instrText xml:space="preserve"> PAGEREF _Toc242095342 \h </w:instrText>
+              <w:instrText xml:space="preserve"> PAGEREF _Toc242097223 \h </w:instrText>
             </w:r>
             <w:r>
               <w:rPr>
@@ -2877,7 +3009,7 @@
               <w14:ligatures w14:val="standardContextual"/>
             </w:rPr>
           </w:pPr>
-          <w:hyperlink w:anchor="_Toc242095343" w:history="1">
+          <w:hyperlink w:anchor="_Toc242097224" w:history="1">
             <w:r>
               <w:rPr>
                 <w:rStyle w:val="Hyperlink"/>
@@ -2901,7 +3033,7 @@
               <w:rPr>
                 <w:noProof/>
               </w:rPr>
-              <w:instrText xml:space="preserve"> PAGEREF _Toc242095343 \h </w:instrText>
+              <w:instrText xml:space="preserve"> PAGEREF _Toc242097224 \h </w:instrText>
             </w:r>
             <w:r>
               <w:rPr>
@@ -2944,7 +3076,7 @@
               <w14:ligatures w14:val="standardContextual"/>
             </w:rPr>
           </w:pPr>
-          <w:hyperlink w:anchor="_Toc242095344" w:history="1">
+          <w:hyperlink w:anchor="_Toc242097225" w:history="1">
             <w:r>
               <w:rPr>
                 <w:rStyle w:val="Hyperlink"/>
@@ -2968,7 +3100,7 @@
               <w:rPr>
                 <w:noProof/>
               </w:rPr>
-              <w:instrText xml:space="preserve"> PAGEREF _Toc242095344 \h </w:instrText>
+              <w:instrText xml:space="preserve"> PAGEREF _Toc242097225 \h </w:instrText>
             </w:r>
             <w:r>
               <w:rPr>
@@ -3011,7 +3143,7 @@
               <w14:ligatures w14:val="standardContextual"/>
             </w:rPr>
           </w:pPr>
-          <w:hyperlink w:anchor="_Toc242095345" w:history="1">
+          <w:hyperlink w:anchor="_Toc242097226" w:history="1">
             <w:r>
               <w:rPr>
                 <w:rStyle w:val="Hyperlink"/>
@@ -3035,7 +3167,7 @@
               <w:rPr>
                 <w:noProof/>
               </w:rPr>
-              <w:instrText xml:space="preserve"> PAGEREF _Toc242095345 \h </w:instrText>
+              <w:instrText xml:space="preserve"> PAGEREF _Toc242097226 \h </w:instrText>
             </w:r>
             <w:r>
               <w:rPr>
@@ -3078,7 +3210,7 @@
               <w14:ligatures w14:val="standardContextual"/>
             </w:rPr>
           </w:pPr>
-          <w:hyperlink w:anchor="_Toc242095346" w:history="1">
+          <w:hyperlink w:anchor="_Toc242097227" w:history="1">
             <w:r>
               <w:rPr>
                 <w:rStyle w:val="Hyperlink"/>
@@ -3102,7 +3234,7 @@
               <w:rPr>
                 <w:noProof/>
               </w:rPr>
-              <w:instrText xml:space="preserve"> PAGEREF _Toc242095346 \h </w:instrText>
+              <w:instrText xml:space="preserve"> PAGEREF _Toc242097227 \h </w:instrText>
             </w:r>
             <w:r>
               <w:rPr>
@@ -3145,7 +3277,7 @@
               <w14:ligatures w14:val="standardContextual"/>
             </w:rPr>
           </w:pPr>
-          <w:hyperlink w:anchor="_Toc242095347" w:history="1">
+          <w:hyperlink w:anchor="_Toc242097228" w:history="1">
             <w:r>
               <w:rPr>
                 <w:rStyle w:val="Hyperlink"/>
@@ -3169,7 +3301,7 @@
               <w:rPr>
                 <w:noProof/>
               </w:rPr>
-              <w:instrText xml:space="preserve"> PAGEREF _Toc242095347 \h </w:instrText>
+              <w:instrText xml:space="preserve"> PAGEREF _Toc242097228 \h </w:instrText>
             </w:r>
             <w:r>
               <w:rPr>
@@ -3212,7 +3344,7 @@
               <w14:ligatures w14:val="standardContextual"/>
             </w:rPr>
           </w:pPr>
-          <w:hyperlink w:anchor="_Toc242095348" w:history="1">
+          <w:hyperlink w:anchor="_Toc242097229" w:history="1">
             <w:r>
               <w:rPr>
                 <w:rStyle w:val="Hyperlink"/>
@@ -3236,7 +3368,7 @@
               <w:rPr>
                 <w:noProof/>
               </w:rPr>
-              <w:instrText xml:space="preserve"> PAGEREF _Toc242095348 \h </w:instrText>
+              <w:instrText xml:space="preserve"> PAGEREF _Toc242097229 \h </w:instrText>
             </w:r>
             <w:r>
               <w:rPr>
@@ -3279,7 +3411,7 @@
               <w14:ligatures w14:val="standardContextual"/>
             </w:rPr>
           </w:pPr>
-          <w:hyperlink w:anchor="_Toc242095349" w:history="1">
+          <w:hyperlink w:anchor="_Toc242097230" w:history="1">
             <w:r>
               <w:rPr>
                 <w:rStyle w:val="Hyperlink"/>
@@ -3303,7 +3435,7 @@
               <w:rPr>
                 <w:noProof/>
               </w:rPr>
-              <w:instrText xml:space="preserve"> PAGEREF _Toc242095349 \h </w:instrText>
+              <w:instrText xml:space="preserve"> PAGEREF _Toc242097230 \h </w:instrText>
             </w:r>
             <w:r>
               <w:rPr>
@@ -3346,7 +3478,7 @@
               <w14:ligatures w14:val="standardContextual"/>
             </w:rPr>
           </w:pPr>
-          <w:hyperlink w:anchor="_Toc242095350" w:history="1">
+          <w:hyperlink w:anchor="_Toc242097231" w:history="1">
             <w:r>
               <w:rPr>
                 <w:rStyle w:val="Hyperlink"/>
@@ -3370,7 +3502,7 @@
               <w:rPr>
                 <w:noProof/>
               </w:rPr>
-              <w:instrText xml:space="preserve"> PAGEREF _Toc242095350 \h </w:instrText>
+              <w:instrText xml:space="preserve"> PAGEREF _Toc242097231 \h </w:instrText>
             </w:r>
             <w:r>
               <w:rPr>
@@ -3413,7 +3545,7 @@
               <w14:ligatures w14:val="standardContextual"/>
             </w:rPr>
           </w:pPr>
-          <w:hyperlink w:anchor="_Toc242095351" w:history="1">
+          <w:hyperlink w:anchor="_Toc242097232" w:history="1">
             <w:r>
               <w:rPr>
                 <w:rStyle w:val="Hyperlink"/>
@@ -3437,7 +3569,7 @@
               <w:rPr>
                 <w:noProof/>
               </w:rPr>
-              <w:instrText xml:space="preserve"> PAGEREF _Toc242095351 \h </w:instrText>
+              <w:instrText xml:space="preserve"> PAGEREF _Toc242097232 \h </w:instrText>
             </w:r>
             <w:r>
               <w:rPr>
@@ -3480,7 +3612,7 @@
               <w14:ligatures w14:val="standardContextual"/>
             </w:rPr>
           </w:pPr>
-          <w:hyperlink w:anchor="_Toc242095352" w:history="1">
+          <w:hyperlink w:anchor="_Toc242097233" w:history="1">
             <w:r>
               <w:rPr>
                 <w:rStyle w:val="Hyperlink"/>
@@ -3504,7 +3636,7 @@
               <w:rPr>
                 <w:noProof/>
               </w:rPr>
-              <w:instrText xml:space="preserve"> PAGEREF _Toc242095352 \h </w:instrText>
+              <w:instrText xml:space="preserve"> PAGEREF _Toc242097233 \h </w:instrText>
             </w:r>
             <w:r>
               <w:rPr>
@@ -3547,7 +3679,7 @@
               <w14:ligatures w14:val="standardContextual"/>
             </w:rPr>
           </w:pPr>
-          <w:hyperlink w:anchor="_Toc242095353" w:history="1">
+          <w:hyperlink w:anchor="_Toc242097234" w:history="1">
             <w:r>
               <w:rPr>
                 <w:rStyle w:val="Hyperlink"/>
@@ -3571,7 +3703,7 @@
               <w:rPr>
                 <w:noProof/>
               </w:rPr>
-              <w:instrText xml:space="preserve"> PAGEREF _Toc242095353 \h </w:instrText>
+              <w:instrText xml:space="preserve"> PAGEREF _Toc242097234 \h </w:instrText>
             </w:r>
             <w:r>
               <w:rPr>
@@ -3614,7 +3746,7 @@
               <w14:ligatures w14:val="standardContextual"/>
             </w:rPr>
           </w:pPr>
-          <w:hyperlink w:anchor="_Toc242095354" w:history="1">
+          <w:hyperlink w:anchor="_Toc242097235" w:history="1">
             <w:r>
               <w:rPr>
                 <w:rStyle w:val="Hyperlink"/>
@@ -3638,7 +3770,7 @@
               <w:rPr>
                 <w:noProof/>
               </w:rPr>
-              <w:instrText xml:space="preserve"> PAGEREF _Toc242095354 \h </w:instrText>
+              <w:instrText xml:space="preserve"> PAGEREF _Toc242097235 \h </w:instrText>
             </w:r>
             <w:r>
               <w:rPr>
@@ -3681,7 +3813,7 @@
               <w14:ligatures w14:val="standardContextual"/>
             </w:rPr>
           </w:pPr>
-          <w:hyperlink w:anchor="_Toc242095355" w:history="1">
+          <w:hyperlink w:anchor="_Toc242097236" w:history="1">
             <w:r>
               <w:rPr>
                 <w:rStyle w:val="Hyperlink"/>
@@ -3705,7 +3837,7 @@
               <w:rPr>
                 <w:noProof/>
               </w:rPr>
-              <w:instrText xml:space="preserve"> PAGEREF _Toc242095355 \h </w:instrText>
+              <w:instrText xml:space="preserve"> PAGEREF _Toc242097236 \h </w:instrText>
             </w:r>
             <w:r>
               <w:rPr>
@@ -3748,7 +3880,7 @@
               <w14:ligatures w14:val="standardContextual"/>
             </w:rPr>
           </w:pPr>
-          <w:hyperlink w:anchor="_Toc242095356" w:history="1">
+          <w:hyperlink w:anchor="_Toc242097237" w:history="1">
             <w:r>
               <w:rPr>
                 <w:rStyle w:val="Hyperlink"/>
@@ -3772,7 +3904,7 @@
               <w:rPr>
                 <w:noProof/>
               </w:rPr>
-              <w:instrText xml:space="preserve"> PAGEREF _Toc242095356 \h </w:instrText>
+              <w:instrText xml:space="preserve"> PAGEREF _Toc242097237 \h </w:instrText>
             </w:r>
             <w:r>
               <w:rPr>
@@ -3815,7 +3947,7 @@
               <w14:ligatures w14:val="standardContextual"/>
             </w:rPr>
           </w:pPr>
-          <w:hyperlink w:anchor="_Toc242095357" w:history="1">
+          <w:hyperlink w:anchor="_Toc242097238" w:history="1">
             <w:r>
               <w:rPr>
                 <w:rStyle w:val="Hyperlink"/>
@@ -3839,7 +3971,7 @@
               <w:rPr>
                 <w:noProof/>
               </w:rPr>
-              <w:instrText xml:space="preserve"> PAGEREF _Toc242095357 \h </w:instrText>
+              <w:instrText xml:space="preserve"> PAGEREF _Toc242097238 \h </w:instrText>
             </w:r>
             <w:r>
               <w:rPr>
@@ -3882,7 +4014,7 @@
               <w14:ligatures w14:val="standardContextual"/>
             </w:rPr>
           </w:pPr>
-          <w:hyperlink w:anchor="_Toc242095358" w:history="1">
+          <w:hyperlink w:anchor="_Toc242097239" w:history="1">
             <w:r>
               <w:rPr>
                 <w:rStyle w:val="Hyperlink"/>
@@ -3906,7 +4038,7 @@
               <w:rPr>
                 <w:noProof/>
               </w:rPr>
-              <w:instrText xml:space="preserve"> PAGEREF _Toc242095358 \h </w:instrText>
+              <w:instrText xml:space="preserve"> PAGEREF _Toc242097239 \h </w:instrText>
             </w:r>
             <w:r>
               <w:rPr>
@@ -3949,7 +4081,7 @@
               <w14:ligatures w14:val="standardContextual"/>
             </w:rPr>
           </w:pPr>
-          <w:hyperlink w:anchor="_Toc242095359" w:history="1">
+          <w:hyperlink w:anchor="_Toc242097240" w:history="1">
             <w:r>
               <w:rPr>
                 <w:rStyle w:val="Hyperlink"/>
@@ -3973,7 +4105,7 @@
               <w:rPr>
                 <w:noProof/>
               </w:rPr>
-              <w:instrText xml:space="preserve"> PAGEREF _Toc242095359 \h </w:instrText>
+              <w:instrText xml:space="preserve"> PAGEREF _Toc242097240 \h </w:instrText>
             </w:r>
             <w:r>
               <w:rPr>
@@ -4016,7 +4148,7 @@
               <w14:ligatures w14:val="standardContextual"/>
             </w:rPr>
           </w:pPr>
-          <w:hyperlink w:anchor="_Toc242095360" w:history="1">
+          <w:hyperlink w:anchor="_Toc242097241" w:history="1">
             <w:r>
               <w:rPr>
                 <w:rStyle w:val="Hyperlink"/>
@@ -4040,7 +4172,7 @@
               <w:rPr>
                 <w:noProof/>
               </w:rPr>
-              <w:instrText xml:space="preserve"> PAGEREF _Toc242095360 \h </w:instrText>
+              <w:instrText xml:space="preserve"> PAGEREF _Toc242097241 \h </w:instrText>
             </w:r>
             <w:r>
               <w:rPr>
@@ -4083,7 +4215,7 @@
               <w14:ligatures w14:val="standardContextual"/>
             </w:rPr>
           </w:pPr>
-          <w:hyperlink w:anchor="_Toc242095361" w:history="1">
+          <w:hyperlink w:anchor="_Toc242097242" w:history="1">
             <w:r>
               <w:rPr>
                 <w:rStyle w:val="Hyperlink"/>
@@ -4107,7 +4239,7 @@
               <w:rPr>
                 <w:noProof/>
               </w:rPr>
-              <w:instrText xml:space="preserve"> PAGEREF _Toc242095361 \h </w:instrText>
+              <w:instrText xml:space="preserve"> PAGEREF _Toc242097242 \h </w:instrText>
             </w:r>
             <w:r>
               <w:rPr>
@@ -4150,7 +4282,7 @@
               <w14:ligatures w14:val="standardContextual"/>
             </w:rPr>
           </w:pPr>
-          <w:hyperlink w:anchor="_Toc242095362" w:history="1">
+          <w:hyperlink w:anchor="_Toc242097243" w:history="1">
             <w:r>
               <w:rPr>
                 <w:rStyle w:val="Hyperlink"/>
@@ -4174,7 +4306,7 @@
               <w:rPr>
                 <w:noProof/>
               </w:rPr>
-              <w:instrText xml:space="preserve"> PAGEREF _Toc242095362 \h </w:instrText>
+              <w:instrText xml:space="preserve"> PAGEREF _Toc242097243 \h </w:instrText>
             </w:r>
             <w:r>
               <w:rPr>
@@ -4221,7 +4353,7 @@
     <w:sdt>
       <w:sdtPr>
         <w:alias w:val="Figures"/>
-        <w:id w:val="-351419836"/>
+        <w:id w:val="-1849475215"/>
       </w:sdtPr>
       <w:sdtEndPr/>
       <w:sdtContent>
@@ -4250,7 +4382,7 @@
           <w:r>
             <w:fldChar w:fldCharType="separate"/>
           </w:r>
-          <w:hyperlink w:anchor="_Toc242095363" w:history="1">
+          <w:hyperlink w:anchor="_Toc242097244" w:history="1">
             <w:r>
               <w:rPr>
                 <w:rStyle w:val="Hyperlink"/>
@@ -4274,7 +4406,7 @@
               <w:rPr>
                 <w:noProof/>
               </w:rPr>
-              <w:instrText xml:space="preserve"> PAGEREF _Toc242095363 \h </w:instrText>
+              <w:instrText xml:space="preserve"> PAGEREF _Toc242097244 \h </w:instrText>
             </w:r>
             <w:r>
               <w:rPr>
@@ -4317,7 +4449,7 @@
               <w14:ligatures w14:val="standardContextual"/>
             </w:rPr>
           </w:pPr>
-          <w:hyperlink w:anchor="_Toc242095364" w:history="1">
+          <w:hyperlink w:anchor="_Toc242097245" w:history="1">
             <w:r>
               <w:rPr>
                 <w:rStyle w:val="Hyperlink"/>
@@ -4341,7 +4473,7 @@
               <w:rPr>
                 <w:noProof/>
               </w:rPr>
-              <w:instrText xml:space="preserve"> PAGEREF _Toc242095364 \h </w:instrText>
+              <w:instrText xml:space="preserve"> PAGEREF _Toc242097245 \h </w:instrText>
             </w:r>
             <w:r>
               <w:rPr>
@@ -4384,7 +4516,7 @@
               <w14:ligatures w14:val="standardContextual"/>
             </w:rPr>
           </w:pPr>
-          <w:hyperlink w:anchor="_Toc242095365" w:history="1">
+          <w:hyperlink w:anchor="_Toc242097246" w:history="1">
             <w:r>
               <w:rPr>
                 <w:rStyle w:val="Hyperlink"/>
@@ -4408,7 +4540,7 @@
               <w:rPr>
                 <w:noProof/>
               </w:rPr>
-              <w:instrText xml:space="preserve"> PAGEREF _Toc242095365 \h </w:instrText>
+              <w:instrText xml:space="preserve"> PAGEREF _Toc242097246 \h </w:instrText>
             </w:r>
             <w:r>
               <w:rPr>
@@ -4454,7 +4586,7 @@
     <w:sdt>
       <w:sdtPr>
         <w:alias w:val="Tables"/>
-        <w:id w:val="138923705"/>
+        <w:id w:val="319006926"/>
       </w:sdtPr>
       <w:sdtEndPr/>
       <w:sdtContent>
@@ -4483,7 +4615,7 @@
           <w:r>
             <w:fldChar w:fldCharType="separate"/>
           </w:r>
-          <w:hyperlink w:anchor="_Toc242095366" w:history="1">
+          <w:hyperlink w:anchor="_Toc242097247" w:history="1">
             <w:r>
               <w:rPr>
                 <w:rStyle w:val="Hyperlink"/>
@@ -4507,7 +4639,7 @@
               <w:rPr>
                 <w:noProof/>
               </w:rPr>
-              <w:instrText xml:space="preserve"> PAGEREF _Toc242095366 \h </w:instrText>
+              <w:instrText xml:space="preserve"> PAGEREF _Toc242097247 \h </w:instrText>
             </w:r>
             <w:r>
               <w:rPr>
@@ -4550,7 +4682,7 @@
               <w14:ligatures w14:val="standardContextual"/>
             </w:rPr>
           </w:pPr>
-          <w:hyperlink w:anchor="_Toc242095367" w:history="1">
+          <w:hyperlink w:anchor="_Toc242097248" w:history="1">
             <w:r>
               <w:rPr>
                 <w:rStyle w:val="Hyperlink"/>
@@ -4574,7 +4706,7 @@
               <w:rPr>
                 <w:noProof/>
               </w:rPr>
-              <w:instrText xml:space="preserve"> PAGEREF _Toc242095367 \h </w:instrText>
+              <w:instrText xml:space="preserve"> PAGEREF _Toc242097248 \h </w:instrText>
             </w:r>
             <w:r>
               <w:rPr>
@@ -4617,7 +4749,7 @@
               <w14:ligatures w14:val="standardContextual"/>
             </w:rPr>
           </w:pPr>
-          <w:hyperlink w:anchor="_Toc242095368" w:history="1">
+          <w:hyperlink w:anchor="_Toc242097249" w:history="1">
             <w:r>
               <w:rPr>
                 <w:rStyle w:val="Hyperlink"/>
@@ -4641,7 +4773,7 @@
               <w:rPr>
                 <w:noProof/>
               </w:rPr>
-              <w:instrText xml:space="preserve"> PAGEREF _Toc242095368 \h </w:instrText>
+              <w:instrText xml:space="preserve"> PAGEREF _Toc242097249 \h </w:instrText>
             </w:r>
             <w:r>
               <w:rPr>
@@ -4684,7 +4816,7 @@
               <w14:ligatures w14:val="standardContextual"/>
             </w:rPr>
           </w:pPr>
-          <w:hyperlink w:anchor="_Toc242095369" w:history="1">
+          <w:hyperlink w:anchor="_Toc242097250" w:history="1">
             <w:r>
               <w:rPr>
                 <w:rStyle w:val="Hyperlink"/>
@@ -4708,7 +4840,7 @@
               <w:rPr>
                 <w:noProof/>
               </w:rPr>
-              <w:instrText xml:space="preserve"> PAGEREF _Toc242095369 \h </w:instrText>
+              <w:instrText xml:space="preserve"> PAGEREF _Toc242097250 \h </w:instrText>
             </w:r>
             <w:r>
               <w:rPr>
@@ -4751,7 +4883,7 @@
               <w14:ligatures w14:val="standardContextual"/>
             </w:rPr>
           </w:pPr>
-          <w:hyperlink w:anchor="_Toc242095370" w:history="1">
+          <w:hyperlink w:anchor="_Toc242097251" w:history="1">
             <w:r>
               <w:rPr>
                 <w:rStyle w:val="Hyperlink"/>
@@ -4775,7 +4907,7 @@
               <w:rPr>
                 <w:noProof/>
               </w:rPr>
-              <w:instrText xml:space="preserve"> PAGEREF _Toc242095370 \h </w:instrText>
+              <w:instrText xml:space="preserve"> PAGEREF _Toc242097251 \h </w:instrText>
             </w:r>
             <w:r>
               <w:rPr>
@@ -4818,7 +4950,7 @@
               <w14:ligatures w14:val="standardContextual"/>
             </w:rPr>
           </w:pPr>
-          <w:hyperlink w:anchor="_Toc242095371" w:history="1">
+          <w:hyperlink w:anchor="_Toc242097252" w:history="1">
             <w:r>
               <w:rPr>
                 <w:rStyle w:val="Hyperlink"/>
@@ -4842,7 +4974,7 @@
               <w:rPr>
                 <w:noProof/>
               </w:rPr>
-              <w:instrText xml:space="preserve"> PAGEREF _Toc242095371 \h </w:instrText>
+              <w:instrText xml:space="preserve"> PAGEREF _Toc242097252 \h </w:instrText>
             </w:r>
             <w:r>
               <w:rPr>
@@ -4885,7 +5017,7 @@
               <w14:ligatures w14:val="standardContextual"/>
             </w:rPr>
           </w:pPr>
-          <w:hyperlink w:anchor="_Toc242095372" w:history="1">
+          <w:hyperlink w:anchor="_Toc242097253" w:history="1">
             <w:r>
               <w:rPr>
                 <w:rStyle w:val="Hyperlink"/>
@@ -4909,7 +5041,7 @@
               <w:rPr>
                 <w:noProof/>
               </w:rPr>
-              <w:instrText xml:space="preserve"> PAGEREF _Toc242095372 \h </w:instrText>
+              <w:instrText xml:space="preserve"> PAGEREF _Toc242097253 \h </w:instrText>
             </w:r>
             <w:r>
               <w:rPr>
@@ -4952,7 +5084,7 @@
               <w14:ligatures w14:val="standardContextual"/>
             </w:rPr>
           </w:pPr>
-          <w:hyperlink w:anchor="_Toc242095373" w:history="1">
+          <w:hyperlink w:anchor="_Toc242097254" w:history="1">
             <w:r>
               <w:rPr>
                 <w:rStyle w:val="Hyperlink"/>
@@ -4976,7 +5108,7 @@
               <w:rPr>
                 <w:noProof/>
               </w:rPr>
-              <w:instrText xml:space="preserve"> PAGEREF _Toc242095373 \h </w:instrText>
+              <w:instrText xml:space="preserve"> PAGEREF _Toc242097254 \h </w:instrText>
             </w:r>
             <w:r>
               <w:rPr>
@@ -5019,7 +5151,7 @@
               <w14:ligatures w14:val="standardContextual"/>
             </w:rPr>
           </w:pPr>
-          <w:hyperlink w:anchor="_Toc242095374" w:history="1">
+          <w:hyperlink w:anchor="_Toc242097255" w:history="1">
             <w:r>
               <w:rPr>
                 <w:rStyle w:val="Hyperlink"/>
@@ -5043,7 +5175,7 @@
               <w:rPr>
                 <w:noProof/>
               </w:rPr>
-              <w:instrText xml:space="preserve"> PAGEREF _Toc242095374 \h </w:instrText>
+              <w:instrText xml:space="preserve"> PAGEREF _Toc242097255 \h </w:instrText>
             </w:r>
             <w:r>
               <w:rPr>
@@ -5084,7 +5216,7 @@
         <w:keepLines/>
         <w:pageBreakBefore/>
       </w:pPr>
-      <w:bookmarkStart w:id="0" w:name="_Toc242095328"/>
+      <w:bookmarkStart w:id="0" w:name="_Toc242097209"/>
       <w:r>
         <w:lastRenderedPageBreak/>
         <w:t>1 Introduction</w:t>
@@ -5097,7 +5229,7 @@
         <w:keepNext/>
         <w:keepLines/>
       </w:pPr>
-      <w:bookmarkStart w:id="1" w:name="_Toc242095329"/>
+      <w:bookmarkStart w:id="1" w:name="_Toc242097210"/>
       <w:r>
         <w:t>1.1 Purpose</w:t>
       </w:r>
@@ -5108,10 +5240,7 @@
         <w:spacing w:after="120"/>
       </w:pPr>
       <w:r>
-        <w:t xml:space="preserve">This standard defines how every ZedPath engineering document is identified, structured, written, styled, reviewed, approved and changed. Following one standard makes the document set consistent, lets any reader </w:t>
-      </w:r>
-      <w:r>
-        <w:t>find the same information in the same place, and lets every requirement be traced from the evidence that justified it to the test that proves it.</w:t>
+        <w:t>This standard defines how every ZedPath engineering document is identified, structured, written, styled, reviewed, approved and changed. Following one standard makes the document set consistent, lets any reader find the same information in the same place, and lets every requirement be traced from the evidence that justified it to the test that proves it.</w:t>
       </w:r>
     </w:p>
     <w:p>
@@ -5120,7 +5249,7 @@
         <w:keepNext/>
         <w:keepLines/>
       </w:pPr>
-      <w:bookmarkStart w:id="2" w:name="_Toc242095330"/>
+      <w:bookmarkStart w:id="2" w:name="_Toc242097211"/>
       <w:r>
         <w:t>1.2 Scope</w:t>
       </w:r>
@@ -5143,7 +5272,10 @@
         <w:t>docs/</w:t>
       </w:r>
       <w:r>
-        <w:t xml:space="preserve"> folder of the ZedPath repository (ZP-DOC-00 to ZP-DOC-08 and any later additions). It does not apply to source-code comments, commit messages or the repository README, which follow the conventions in the project CLAUDE.md.</w:t>
+        <w:t xml:space="preserve"> folder of the ZedPath repository (ZP-DOC-00 to </w:t>
+      </w:r>
+      <w:r>
+        <w:t>ZP-DOC-08 and any later additions). It does not apply to source-code comments, commit messages or the repository README, which follow the conventions in the project CLAUDE.md.</w:t>
       </w:r>
     </w:p>
     <w:p>
@@ -5152,7 +5284,7 @@
         <w:keepNext/>
         <w:keepLines/>
       </w:pPr>
-      <w:bookmarkStart w:id="3" w:name="_Toc242095331"/>
+      <w:bookmarkStart w:id="3" w:name="_Toc242097212"/>
       <w:r>
         <w:t>1.3 Intended audience</w:t>
       </w:r>
@@ -5172,7 +5304,7 @@
         <w:keepNext/>
         <w:keepLines/>
       </w:pPr>
-      <w:bookmarkStart w:id="4" w:name="_Toc242095332"/>
+      <w:bookmarkStart w:id="4" w:name="_Toc242097213"/>
       <w:r>
         <w:t>1.4 Conformance</w:t>
       </w:r>
@@ -5213,7 +5345,7 @@
         <w:keepLines/>
         <w:pageBreakBefore/>
       </w:pPr>
-      <w:bookmarkStart w:id="5" w:name="_Toc242095333"/>
+      <w:bookmarkStart w:id="5" w:name="_Toc242097214"/>
       <w:r>
         <w:lastRenderedPageBreak/>
         <w:t>2 The document set</w:t>
@@ -5226,7 +5358,7 @@
         <w:keepNext/>
         <w:keepLines/>
       </w:pPr>
-      <w:bookmarkStart w:id="6" w:name="_Toc242095334"/>
+      <w:bookmarkStart w:id="6" w:name="_Toc242097215"/>
       <w:r>
         <w:t>2.1 Document register</w:t>
       </w:r>
@@ -5265,7 +5397,7 @@
         <w:pStyle w:val="Caption"/>
         <w:keepNext/>
       </w:pPr>
-      <w:bookmarkStart w:id="7" w:name="_Toc242095366"/>
+      <w:bookmarkStart w:id="7" w:name="_Toc242097247"/>
       <w:r>
         <w:t xml:space="preserve">Table </w:t>
       </w:r>
@@ -5307,7 +5439,7 @@
           <w:left w:w="10" w:type="dxa"/>
           <w:right w:w="10" w:type="dxa"/>
         </w:tblCellMar>
-        <w:tblLook w:val="04A0" w:firstRow="1" w:lastRow="0" w:firstColumn="1" w:lastColumn="0" w:noHBand="0" w:noVBand="1"/>
+        <w:tblLook w:val="0000" w:firstRow="0" w:lastRow="0" w:firstColumn="0" w:lastColumn="0" w:noHBand="0" w:noVBand="0"/>
       </w:tblPr>
       <w:tblGrid>
         <w:gridCol w:w="1130"/>
@@ -6676,7 +6808,7 @@
         </w:rPr>
         <w:lastRenderedPageBreak/>
         <w:drawing>
-          <wp:inline distT="0" distB="0" distL="0" distR="0" wp14:anchorId="509DFEA3" wp14:editId="509DFEA4">
+          <wp:inline distT="0" distB="0" distL="0" distR="0" wp14:anchorId="7A92E9BF" wp14:editId="7A92E9C0">
             <wp:extent cx="4714875" cy="8191500"/>
             <wp:effectExtent l="0" t="0" r="0" b="0"/>
             <wp:docPr id="1" name="document-chain.png" descr="Dependencies between ZedPath documents" title="Dependencies between ZedPath documents"/>
@@ -6719,7 +6851,7 @@
       <w:pPr>
         <w:pStyle w:val="Caption"/>
       </w:pPr>
-      <w:bookmarkStart w:id="8" w:name="_Toc242095363"/>
+      <w:bookmarkStart w:id="8" w:name="_Toc242097244"/>
       <w:r>
         <w:t xml:space="preserve">Figure </w:t>
       </w:r>
@@ -6752,7 +6884,7 @@
         <w:keepNext/>
         <w:keepLines/>
       </w:pPr>
-      <w:bookmarkStart w:id="9" w:name="_Toc242095335"/>
+      <w:bookmarkStart w:id="9" w:name="_Toc242097216"/>
       <w:r>
         <w:t>2.2 Folder and file layout</w:t>
       </w:r>
@@ -6952,7 +7084,7 @@
         <w:keepLines/>
         <w:pageBreakBefore/>
       </w:pPr>
-      <w:bookmarkStart w:id="10" w:name="_Toc242095336"/>
+      <w:bookmarkStart w:id="10" w:name="_Toc242097217"/>
       <w:r>
         <w:lastRenderedPageBreak/>
         <w:t>3 Identification</w:t>
@@ -6965,7 +7097,7 @@
         <w:keepNext/>
         <w:keepLines/>
       </w:pPr>
-      <w:bookmarkStart w:id="11" w:name="_Toc242095337"/>
+      <w:bookmarkStart w:id="11" w:name="_Toc242097218"/>
       <w:r>
         <w:t>3.1 Document identifiers</w:t>
       </w:r>
@@ -6986,10 +7118,7 @@
         <w:t>ZP-DOC-NN</w:t>
       </w:r>
       <w:r>
-        <w:t xml:space="preserve">. Identifiers are never reused, even if a document is </w:t>
-      </w:r>
-      <w:r>
-        <w:t>withdrawn.</w:t>
+        <w:t>. Identifiers are never reused, even if a document is withdrawn.</w:t>
       </w:r>
     </w:p>
     <w:p>
@@ -6998,7 +7127,7 @@
         <w:keepNext/>
         <w:keepLines/>
       </w:pPr>
-      <w:bookmarkStart w:id="12" w:name="_Toc242095338"/>
+      <w:bookmarkStart w:id="12" w:name="_Toc242097219"/>
       <w:r>
         <w:t>3.2 Item identifiers</w:t>
       </w:r>
@@ -7047,7 +7176,7 @@
         <w:pStyle w:val="Caption"/>
         <w:keepNext/>
       </w:pPr>
-      <w:bookmarkStart w:id="13" w:name="_Toc242095367"/>
+      <w:bookmarkStart w:id="13" w:name="_Toc242097248"/>
       <w:r>
         <w:t xml:space="preserve">Table </w:t>
       </w:r>
@@ -7089,7 +7218,7 @@
           <w:left w:w="10" w:type="dxa"/>
           <w:right w:w="10" w:type="dxa"/>
         </w:tblCellMar>
-        <w:tblLook w:val="04A0" w:firstRow="1" w:lastRow="0" w:firstColumn="1" w:lastColumn="0" w:noHBand="0" w:noVBand="1"/>
+        <w:tblLook w:val="0000" w:firstRow="0" w:lastRow="0" w:firstColumn="0" w:lastColumn="0" w:noHBand="0" w:noVBand="0"/>
       </w:tblPr>
       <w:tblGrid>
         <w:gridCol w:w="2225"/>
@@ -9416,7 +9545,7 @@
         <w:keepLines/>
         <w:pageBreakBefore/>
       </w:pPr>
-      <w:bookmarkStart w:id="14" w:name="_Toc242095339"/>
+      <w:bookmarkStart w:id="14" w:name="_Toc242097220"/>
       <w:r>
         <w:lastRenderedPageBreak/>
         <w:t>4 Versioning and status</w:t>
@@ -9429,7 +9558,7 @@
         <w:keepNext/>
         <w:keepLines/>
       </w:pPr>
-      <w:bookmarkStart w:id="15" w:name="_Toc242095340"/>
+      <w:bookmarkStart w:id="15" w:name="_Toc242097221"/>
       <w:r>
         <w:t>4.1 Version numbers</w:t>
       </w:r>
@@ -9541,7 +9670,7 @@
         <w:keepNext/>
         <w:keepLines/>
       </w:pPr>
-      <w:bookmarkStart w:id="16" w:name="_Toc242095341"/>
+      <w:bookmarkStart w:id="16" w:name="_Toc242097222"/>
       <w:r>
         <w:t>4.2 Status lifecycle</w:t>
       </w:r>
@@ -9576,7 +9705,7 @@
           <w:noProof/>
         </w:rPr>
         <w:drawing>
-          <wp:inline distT="0" distB="0" distL="0" distR="0" wp14:anchorId="509DFEA5" wp14:editId="509DFEA6">
+          <wp:inline distT="0" distB="0" distL="0" distR="0" wp14:anchorId="7A92E9C1" wp14:editId="7A92E9C2">
             <wp:extent cx="6124575" cy="4048125"/>
             <wp:effectExtent l="0" t="0" r="0" b="0"/>
             <wp:docPr id="2" name="status-lifecycle.png" descr="Document status lifecycle" title="Document status lifecycle"/>
@@ -9619,7 +9748,7 @@
       <w:pPr>
         <w:pStyle w:val="Caption"/>
       </w:pPr>
-      <w:bookmarkStart w:id="17" w:name="_Toc242095364"/>
+      <w:bookmarkStart w:id="17" w:name="_Toc242097245"/>
       <w:r>
         <w:t xml:space="preserve">Figure </w:t>
       </w:r>
@@ -9651,7 +9780,7 @@
         <w:pStyle w:val="Caption"/>
         <w:keepNext/>
       </w:pPr>
-      <w:bookmarkStart w:id="18" w:name="_Toc242095368"/>
+      <w:bookmarkStart w:id="18" w:name="_Toc242097249"/>
       <w:r>
         <w:t xml:space="preserve">Table </w:t>
       </w:r>
@@ -9693,7 +9822,7 @@
           <w:left w:w="10" w:type="dxa"/>
           <w:right w:w="10" w:type="dxa"/>
         </w:tblCellMar>
-        <w:tblLook w:val="04A0" w:firstRow="1" w:lastRow="0" w:firstColumn="1" w:lastColumn="0" w:noHBand="0" w:noVBand="1"/>
+        <w:tblLook w:val="0000" w:firstRow="0" w:lastRow="0" w:firstColumn="0" w:lastColumn="0" w:noHBand="0" w:noVBand="0"/>
       </w:tblPr>
       <w:tblGrid>
         <w:gridCol w:w="1626"/>
@@ -10338,7 +10467,7 @@
         <w:keepLines/>
         <w:pageBreakBefore/>
       </w:pPr>
-      <w:bookmarkStart w:id="19" w:name="_Toc242095342"/>
+      <w:bookmarkStart w:id="19" w:name="_Toc242097223"/>
       <w:r>
         <w:lastRenderedPageBreak/>
         <w:t>5 Review and approval</w:t>
@@ -10351,7 +10480,7 @@
         <w:keepNext/>
         <w:keepLines/>
       </w:pPr>
-      <w:bookmarkStart w:id="20" w:name="_Toc242095343"/>
+      <w:bookmarkStart w:id="20" w:name="_Toc242097224"/>
       <w:r>
         <w:t>5.1 Roles</w:t>
       </w:r>
@@ -10362,7 +10491,7 @@
         <w:pStyle w:val="Caption"/>
         <w:keepNext/>
       </w:pPr>
-      <w:bookmarkStart w:id="21" w:name="_Toc242095369"/>
+      <w:bookmarkStart w:id="21" w:name="_Toc242097250"/>
       <w:r>
         <w:t xml:space="preserve">Table </w:t>
       </w:r>
@@ -10404,7 +10533,7 @@
           <w:left w:w="10" w:type="dxa"/>
           <w:right w:w="10" w:type="dxa"/>
         </w:tblCellMar>
-        <w:tblLook w:val="04A0" w:firstRow="1" w:lastRow="0" w:firstColumn="1" w:lastColumn="0" w:noHBand="0" w:noVBand="1"/>
+        <w:tblLook w:val="0000" w:firstRow="0" w:lastRow="0" w:firstColumn="0" w:lastColumn="0" w:noHBand="0" w:noVBand="0"/>
       </w:tblPr>
       <w:tblGrid>
         <w:gridCol w:w="1261"/>
@@ -10947,7 +11076,7 @@
         <w:keepNext/>
         <w:keepLines/>
       </w:pPr>
-      <w:bookmarkStart w:id="22" w:name="_Toc242095344"/>
+      <w:bookmarkStart w:id="22" w:name="_Toc242097225"/>
       <w:r>
         <w:t>5.2 Approval procedure</w:t>
       </w:r>
@@ -11074,7 +11203,7 @@
         <w:keepLines/>
         <w:pageBreakBefore/>
       </w:pPr>
-      <w:bookmarkStart w:id="23" w:name="_Toc242095345"/>
+      <w:bookmarkStart w:id="23" w:name="_Toc242097226"/>
       <w:r>
         <w:lastRenderedPageBreak/>
         <w:t>6 Change control</w:t>
@@ -11216,7 +11345,7 @@
         <w:keepLines/>
         <w:pageBreakBefore/>
       </w:pPr>
-      <w:bookmarkStart w:id="24" w:name="_Toc242095346"/>
+      <w:bookmarkStart w:id="24" w:name="_Toc242097227"/>
       <w:r>
         <w:lastRenderedPageBreak/>
         <w:t>7 Mandatory structure</w:t>
@@ -11229,7 +11358,7 @@
         <w:keepNext/>
         <w:keepLines/>
       </w:pPr>
-      <w:bookmarkStart w:id="25" w:name="_Toc242095347"/>
+      <w:bookmarkStart w:id="25" w:name="_Toc242097228"/>
       <w:r>
         <w:t>7.1 Front matter</w:t>
       </w:r>
@@ -11415,7 +11544,7 @@
         <w:keepNext/>
         <w:keepLines/>
       </w:pPr>
-      <w:bookmarkStart w:id="26" w:name="_Toc242095348"/>
+      <w:bookmarkStart w:id="26" w:name="_Toc242097229"/>
       <w:r>
         <w:t>7.2 Generated front pages</w:t>
       </w:r>
@@ -11485,7 +11614,7 @@
         <w:keepNext/>
         <w:keepLines/>
       </w:pPr>
-      <w:bookmarkStart w:id="27" w:name="_Toc242095349"/>
+      <w:bookmarkStart w:id="27" w:name="_Toc242097230"/>
       <w:r>
         <w:t>7.3 Mandatory sections</w:t>
       </w:r>
@@ -11606,7 +11735,7 @@
         <w:keepLines/>
         <w:pageBreakBefore/>
       </w:pPr>
-      <w:bookmarkStart w:id="28" w:name="_Toc242095350"/>
+      <w:bookmarkStart w:id="28" w:name="_Toc242097231"/>
       <w:r>
         <w:lastRenderedPageBreak/>
         <w:t>8 Writing rules</w:t>
@@ -11619,7 +11748,7 @@
         <w:keepNext/>
         <w:keepLines/>
       </w:pPr>
-      <w:bookmarkStart w:id="29" w:name="_Toc242095351"/>
+      <w:bookmarkStart w:id="29" w:name="_Toc242097232"/>
       <w:r>
         <w:t>8.1 Requirement language</w:t>
       </w:r>
@@ -11630,7 +11759,7 @@
         <w:pStyle w:val="Caption"/>
         <w:keepNext/>
       </w:pPr>
-      <w:bookmarkStart w:id="30" w:name="_Toc242095370"/>
+      <w:bookmarkStart w:id="30" w:name="_Toc242097251"/>
       <w:r>
         <w:t xml:space="preserve">Table </w:t>
       </w:r>
@@ -11672,7 +11801,7 @@
           <w:left w:w="10" w:type="dxa"/>
           <w:right w:w="10" w:type="dxa"/>
         </w:tblCellMar>
-        <w:tblLook w:val="04A0" w:firstRow="1" w:lastRow="0" w:firstColumn="1" w:lastColumn="0" w:noHBand="0" w:noVBand="1"/>
+        <w:tblLook w:val="0000" w:firstRow="0" w:lastRow="0" w:firstColumn="0" w:lastColumn="0" w:noHBand="0" w:noVBand="0"/>
       </w:tblPr>
       <w:tblGrid>
         <w:gridCol w:w="1483"/>
@@ -12066,7 +12195,7 @@
         <w:keepNext/>
         <w:keepLines/>
       </w:pPr>
-      <w:bookmarkStart w:id="31" w:name="_Toc242095352"/>
+      <w:bookmarkStart w:id="31" w:name="_Toc242097233"/>
       <w:r>
         <w:t>8.2 Style rules</w:t>
       </w:r>
@@ -12245,7 +12374,7 @@
         <w:keepNext/>
         <w:keepLines/>
       </w:pPr>
-      <w:bookmarkStart w:id="32" w:name="_Toc242095353"/>
+      <w:bookmarkStart w:id="32" w:name="_Toc242097234"/>
       <w:r>
         <w:t>8.3 Privacy in documents</w:t>
       </w:r>
@@ -12286,7 +12415,7 @@
         <w:keepLines/>
         <w:pageBreakBefore/>
       </w:pPr>
-      <w:bookmarkStart w:id="33" w:name="_Toc242095354"/>
+      <w:bookmarkStart w:id="33" w:name="_Toc242097235"/>
       <w:r>
         <w:lastRenderedPageBreak/>
         <w:t>9 Visual identity</w:t>
@@ -12299,7 +12428,7 @@
         <w:keepNext/>
         <w:keepLines/>
       </w:pPr>
-      <w:bookmarkStart w:id="34" w:name="_Toc242095355"/>
+      <w:bookmarkStart w:id="34" w:name="_Toc242097236"/>
       <w:r>
         <w:t>9.1 Page and typography</w:t>
       </w:r>
@@ -12310,7 +12439,7 @@
         <w:pStyle w:val="Caption"/>
         <w:keepNext/>
       </w:pPr>
-      <w:bookmarkStart w:id="35" w:name="_Toc242095371"/>
+      <w:bookmarkStart w:id="35" w:name="_Toc242097252"/>
       <w:r>
         <w:t xml:space="preserve">Table </w:t>
       </w:r>
@@ -12352,7 +12481,7 @@
           <w:left w:w="10" w:type="dxa"/>
           <w:right w:w="10" w:type="dxa"/>
         </w:tblCellMar>
-        <w:tblLook w:val="04A0" w:firstRow="1" w:lastRow="0" w:firstColumn="1" w:lastColumn="0" w:noHBand="0" w:noVBand="1"/>
+        <w:tblLook w:val="0000" w:firstRow="0" w:lastRow="0" w:firstColumn="0" w:lastColumn="0" w:noHBand="0" w:noVBand="0"/>
       </w:tblPr>
       <w:tblGrid>
         <w:gridCol w:w="1355"/>
@@ -13097,7 +13226,7 @@
         <w:keepNext/>
         <w:keepLines/>
       </w:pPr>
-      <w:bookmarkStart w:id="36" w:name="_Toc242095356"/>
+      <w:bookmarkStart w:id="36" w:name="_Toc242097237"/>
       <w:r>
         <w:t>9.2 Header and footer</w:t>
       </w:r>
@@ -13222,7 +13351,7 @@
         <w:keepNext/>
         <w:keepLines/>
       </w:pPr>
-      <w:bookmarkStart w:id="37" w:name="_Toc242095357"/>
+      <w:bookmarkStart w:id="37" w:name="_Toc242097238"/>
       <w:r>
         <w:t>9.3 Section numbering</w:t>
       </w:r>
@@ -13246,7 +13375,7 @@
         <w:keepLines/>
         <w:pageBreakBefore/>
       </w:pPr>
-      <w:bookmarkStart w:id="38" w:name="_Toc242095358"/>
+      <w:bookmarkStart w:id="38" w:name="_Toc242097239"/>
       <w:r>
         <w:lastRenderedPageBreak/>
         <w:t>10 Diagram standards</w:t>
@@ -13296,7 +13425,7 @@
         <w:pStyle w:val="Caption"/>
         <w:keepNext/>
       </w:pPr>
-      <w:bookmarkStart w:id="39" w:name="_Toc242095372"/>
+      <w:bookmarkStart w:id="39" w:name="_Toc242097253"/>
       <w:r>
         <w:t xml:space="preserve">Table </w:t>
       </w:r>
@@ -13338,7 +13467,7 @@
           <w:left w:w="10" w:type="dxa"/>
           <w:right w:w="10" w:type="dxa"/>
         </w:tblCellMar>
-        <w:tblLook w:val="04A0" w:firstRow="1" w:lastRow="0" w:firstColumn="1" w:lastColumn="0" w:noHBand="0" w:noVBand="1"/>
+        <w:tblLook w:val="0000" w:firstRow="0" w:lastRow="0" w:firstColumn="0" w:lastColumn="0" w:noHBand="0" w:noVBand="0"/>
       </w:tblPr>
       <w:tblGrid>
         <w:gridCol w:w="2410"/>
@@ -14425,7 +14554,7 @@
         <w:keepLines/>
         <w:pageBreakBefore/>
       </w:pPr>
-      <w:bookmarkStart w:id="40" w:name="_Toc242095359"/>
+      <w:bookmarkStart w:id="40" w:name="_Toc242097240"/>
       <w:r>
         <w:lastRenderedPageBreak/>
         <w:t>11 Traceability</w:t>
@@ -14461,7 +14590,7 @@
           <w:noProof/>
         </w:rPr>
         <w:drawing>
-          <wp:inline distT="0" distB="0" distL="0" distR="0" wp14:anchorId="509DFEA7" wp14:editId="509DFEA8">
+          <wp:inline distT="0" distB="0" distL="0" distR="0" wp14:anchorId="7A92E9C3" wp14:editId="7A92E9C4">
             <wp:extent cx="6124575" cy="2066925"/>
             <wp:effectExtent l="0" t="0" r="0" b="0"/>
             <wp:docPr id="3" name="traceability-chain.png" descr="Traceability chain across the document set" title="Traceability chain across the document set"/>
@@ -14504,7 +14633,7 @@
       <w:pPr>
         <w:pStyle w:val="Caption"/>
       </w:pPr>
-      <w:bookmarkStart w:id="41" w:name="_Toc242095365"/>
+      <w:bookmarkStart w:id="41" w:name="_Toc242097246"/>
       <w:r>
         <w:t xml:space="preserve">Figure </w:t>
       </w:r>
@@ -14597,7 +14726,7 @@
         <w:keepLines/>
         <w:pageBreakBefore/>
       </w:pPr>
-      <w:bookmarkStart w:id="42" w:name="_Toc242095360"/>
+      <w:bookmarkStart w:id="42" w:name="_Toc242097241"/>
       <w:r>
         <w:lastRenderedPageBreak/>
         <w:t>12 Tooling and publication</w:t>
@@ -14722,7 +14851,7 @@
         <w:keepLines/>
         <w:pageBreakBefore/>
       </w:pPr>
-      <w:bookmarkStart w:id="43" w:name="_Toc242095361"/>
+      <w:bookmarkStart w:id="43" w:name="_Toc242097242"/>
       <w:r>
         <w:lastRenderedPageBreak/>
         <w:t>Appendix A: Glossary</w:t>
@@ -14734,7 +14863,7 @@
         <w:pStyle w:val="Caption"/>
         <w:keepNext/>
       </w:pPr>
-      <w:bookmarkStart w:id="44" w:name="_Toc242095373"/>
+      <w:bookmarkStart w:id="44" w:name="_Toc242097254"/>
       <w:r>
         <w:t xml:space="preserve">Table </w:t>
       </w:r>
@@ -14776,7 +14905,7 @@
           <w:left w:w="10" w:type="dxa"/>
           <w:right w:w="10" w:type="dxa"/>
         </w:tblCellMar>
-        <w:tblLook w:val="04A0" w:firstRow="1" w:lastRow="0" w:firstColumn="1" w:lastColumn="0" w:noHBand="0" w:noVBand="1"/>
+        <w:tblLook w:val="0000" w:firstRow="0" w:lastRow="0" w:firstColumn="0" w:lastColumn="0" w:noHBand="0" w:noVBand="0"/>
       </w:tblPr>
       <w:tblGrid>
         <w:gridCol w:w="1726"/>
@@ -15378,7 +15507,7 @@
         <w:keepLines/>
         <w:pageBreakBefore/>
       </w:pPr>
-      <w:bookmarkStart w:id="45" w:name="_Toc242095362"/>
+      <w:bookmarkStart w:id="45" w:name="_Toc242097243"/>
       <w:r>
         <w:lastRenderedPageBreak/>
         <w:t>Appendix B: References</w:t>
@@ -15390,7 +15519,7 @@
         <w:pStyle w:val="Caption"/>
         <w:keepNext/>
       </w:pPr>
-      <w:bookmarkStart w:id="46" w:name="_Toc242095374"/>
+      <w:bookmarkStart w:id="46" w:name="_Toc242097255"/>
       <w:r>
         <w:t xml:space="preserve">Table </w:t>
       </w:r>
@@ -15432,7 +15561,7 @@
           <w:left w:w="10" w:type="dxa"/>
           <w:right w:w="10" w:type="dxa"/>
         </w:tblCellMar>
-        <w:tblLook w:val="04A0" w:firstRow="1" w:lastRow="0" w:firstColumn="1" w:lastColumn="0" w:noHBand="0" w:noVBand="1"/>
+        <w:tblLook w:val="0000" w:firstRow="0" w:lastRow="0" w:firstColumn="0" w:lastColumn="0" w:noHBand="0" w:noVBand="0"/>
       </w:tblPr>
       <w:tblGrid>
         <w:gridCol w:w="803"/>
@@ -16796,7 +16925,7 @@
         <w:sz w:val="16"/>
         <w:szCs w:val="16"/>
       </w:rPr>
-      <w:t>ZP-DOC-00  ·  v0.9  ·  In review</w:t>
+      <w:t>ZP-DOC-00  ·  v1.0  ·  Approved</w:t>
     </w:r>
   </w:p>
 </w:hdr>
@@ -16805,10 +16934,10 @@
 <file path=word/numbering.xml><?xml version="1.0" encoding="utf-8"?>
 <w:numbering xmlns:wpc="http://schemas.microsoft.com/office/word/2010/wordprocessingCanvas" xmlns:cx="http://schemas.microsoft.com/office/drawing/2014/chartex" xmlns:cx1="http://schemas.microsoft.com/office/drawing/2015/9/8/chartex" xmlns:cx2="http://schemas.microsoft.com/office/drawing/2015/10/21/chartex" xmlns:cx3="http://schemas.microsoft.com/office/drawing/2016/5/9/chartex" xmlns:cx4="http://schemas.microsoft.com/office/drawing/2016/5/10/chartex" xmlns:cx5="http://schemas.microsoft.com/office/drawing/2016/5/11/chartex" xmlns:cx6="http://schemas.microsoft.com/office/drawing/2016/5/12/chartex" xmlns:cx7="http://schemas.microsoft.com/office/drawing/2016/5/13/chartex" xmlns:cx8="http://schemas.microsoft.com/office/drawing/2016/5/14/chartex" xmlns:mc="http://schemas.openxmlformats.org/markup-compatibility/2006" xmlns:aink="http://schemas.microsoft.com/office/drawing/2016/ink" xmlns:am3d="http://schemas.microsoft.com/office/drawing/2017/model3d" xmlns:o="urn:schemas-microsoft-com:office:office" xmlns:oel="http://schemas.microsoft.com/office/2019/extlst" xmlns:r="http://schemas.openxmlformats.org/officeDocument/2006/relationships" xmlns:m="http://schemas.openxmlformats.org/officeDocument/2006/math" xmlns:v="urn:schemas-microsoft-com:vml" xmlns:wp14="http://schemas.microsoft.com/office/word/2010/wordprocessingDrawing" xmlns:wp="http://schemas.openxmlformats.org/drawingml/2006/wordprocessingDrawing" xmlns:w10="urn:schemas-microsoft-com:office:word" xmlns:w="http://schemas.openxmlformats.org/wordprocessingml/2006/main" xmlns:w14="http://schemas.microsoft.com/office/word/2010/wordml" xmlns:w15="http://schemas.microsoft.com/office/word/2012/wordml" xmlns:w16cex="http://schemas.microsoft.com/office/word/2018/wordml/cex" xmlns:w16cid="http://schemas.microsoft.com/office/word/2016/wordml/cid" xmlns:w16="http://schemas.microsoft.com/office/word/2018/wordml" xmlns:w16du="http://schemas.microsoft.com/office/word/2023/wordml/word16du" xmlns:w16sdtdh="http://schemas.microsoft.com/office/word/2020/wordml/sdtdatahash" xmlns:w16sdtfl="http://schemas.microsoft.com/office/word/2024/wordml/sdtformatlock" xmlns:w16se="http://schemas.microsoft.com/office/word/2015/wordml/symex" xmlns:wpg="http://schemas.microsoft.com/office/word/2010/wordprocessingGroup" xmlns:wpi="http://schemas.microsoft.com/office/word/2010/wordprocessingInk" xmlns:wne="http://schemas.microsoft.com/office/word/2006/wordml" xmlns:wps="http://schemas.microsoft.com/office/word/2010/wordprocessingShape" mc:Ignorable="w14 w15 w16se w16cid w16 w16cex w16sdtdh w16sdtfl w16du wp14">
   <w:abstractNum w:abstractNumId="0" w15:restartNumberingAfterBreak="0">
-    <w:nsid w:val="15C30555"/>
+    <w:nsid w:val="19B024B5"/>
     <w:multiLevelType w:val="hybridMultilevel"/>
-    <w:tmpl w:val="5E1CD822"/>
-    <w:lvl w:ilvl="0" w:tplc="1A208A6C">
+    <w:tmpl w:val="B6FC83A4"/>
+    <w:lvl w:ilvl="0" w:tplc="B428EE1E">
       <w:start w:val="1"/>
       <w:numFmt w:val="decimal"/>
       <w:lvlText w:val="%1."/>
@@ -16817,7 +16946,7 @@
         <w:ind w:left="720" w:hanging="360"/>
       </w:pPr>
     </w:lvl>
-    <w:lvl w:ilvl="1" w:tplc="CFA6CD54" w:tentative="1">
+    <w:lvl w:ilvl="1" w:tplc="7BEC78AA" w:tentative="1">
       <w:start w:val="1"/>
       <w:numFmt w:val="lowerLetter"/>
       <w:lvlText w:val="%2."/>
@@ -16826,7 +16955,7 @@
         <w:ind w:left="1080" w:hanging="360"/>
       </w:pPr>
     </w:lvl>
-    <w:lvl w:ilvl="2" w:tplc="A240EA40" w:tentative="1">
+    <w:lvl w:ilvl="2" w:tplc="8E3C36FC" w:tentative="1">
       <w:start w:val="1"/>
       <w:numFmt w:val="lowerRoman"/>
       <w:lvlText w:val="%3."/>
@@ -16835,42 +16964,104 @@
         <w:ind w:left="1440" w:hanging="360"/>
       </w:pPr>
     </w:lvl>
-    <w:lvl w:ilvl="3" w:tplc="243C5B7E">
+    <w:lvl w:ilvl="3" w:tplc="BF64DA2C">
       <w:numFmt w:val="decimal"/>
       <w:lvlText w:val=""/>
       <w:lvlJc w:val="left"/>
     </w:lvl>
-    <w:lvl w:ilvl="4" w:tplc="7BDE6F26">
+    <w:lvl w:ilvl="4" w:tplc="8A6AAB3E">
       <w:numFmt w:val="decimal"/>
       <w:lvlText w:val=""/>
       <w:lvlJc w:val="left"/>
     </w:lvl>
-    <w:lvl w:ilvl="5" w:tplc="66E87074">
+    <w:lvl w:ilvl="5" w:tplc="FE1AC646">
       <w:numFmt w:val="decimal"/>
       <w:lvlText w:val=""/>
       <w:lvlJc w:val="left"/>
     </w:lvl>
-    <w:lvl w:ilvl="6" w:tplc="88C4314C">
+    <w:lvl w:ilvl="6" w:tplc="EF0C6448">
       <w:numFmt w:val="decimal"/>
       <w:lvlText w:val=""/>
       <w:lvlJc w:val="left"/>
     </w:lvl>
-    <w:lvl w:ilvl="7" w:tplc="92A8D6A4">
+    <w:lvl w:ilvl="7" w:tplc="938249C8">
       <w:numFmt w:val="decimal"/>
       <w:lvlText w:val=""/>
       <w:lvlJc w:val="left"/>
     </w:lvl>
-    <w:lvl w:ilvl="8" w:tplc="F25C67D0">
+    <w:lvl w:ilvl="8" w:tplc="CE02D354">
       <w:numFmt w:val="decimal"/>
       <w:lvlText w:val=""/>
       <w:lvlJc w:val="left"/>
     </w:lvl>
   </w:abstractNum>
   <w:abstractNum w:abstractNumId="1" w15:restartNumberingAfterBreak="0">
-    <w:nsid w:val="57EE0187"/>
+    <w:nsid w:val="4D866232"/>
     <w:multiLevelType w:val="hybridMultilevel"/>
-    <w:tmpl w:val="0AFCD0F2"/>
-    <w:lvl w:ilvl="0" w:tplc="49522750" w:tentative="1">
+    <w:tmpl w:val="A764199A"/>
+    <w:lvl w:ilvl="0" w:tplc="AA783116">
+      <w:start w:val="1"/>
+      <w:numFmt w:val="bullet"/>
+      <w:lvlText w:val="•"/>
+      <w:lvlJc w:val="left"/>
+      <w:pPr>
+        <w:ind w:left="720" w:hanging="280"/>
+      </w:pPr>
+    </w:lvl>
+    <w:lvl w:ilvl="1" w:tplc="7CF8B5D0" w:tentative="1">
+      <w:start w:val="1"/>
+      <w:numFmt w:val="bullet"/>
+      <w:lvlText w:val="–"/>
+      <w:lvlJc w:val="left"/>
+      <w:pPr>
+        <w:ind w:left="1080" w:hanging="280"/>
+      </w:pPr>
+    </w:lvl>
+    <w:lvl w:ilvl="2" w:tplc="5F0E2E48" w:tentative="1">
+      <w:start w:val="1"/>
+      <w:numFmt w:val="bullet"/>
+      <w:lvlText w:val="▪"/>
+      <w:lvlJc w:val="left"/>
+      <w:pPr>
+        <w:ind w:left="1440" w:hanging="280"/>
+      </w:pPr>
+    </w:lvl>
+    <w:lvl w:ilvl="3" w:tplc="C750C6C2">
+      <w:numFmt w:val="decimal"/>
+      <w:lvlText w:val=""/>
+      <w:lvlJc w:val="left"/>
+    </w:lvl>
+    <w:lvl w:ilvl="4" w:tplc="AA2E54C8">
+      <w:numFmt w:val="decimal"/>
+      <w:lvlText w:val=""/>
+      <w:lvlJc w:val="left"/>
+    </w:lvl>
+    <w:lvl w:ilvl="5" w:tplc="D81091B0">
+      <w:numFmt w:val="decimal"/>
+      <w:lvlText w:val=""/>
+      <w:lvlJc w:val="left"/>
+    </w:lvl>
+    <w:lvl w:ilvl="6" w:tplc="921E0E72">
+      <w:numFmt w:val="decimal"/>
+      <w:lvlText w:val=""/>
+      <w:lvlJc w:val="left"/>
+    </w:lvl>
+    <w:lvl w:ilvl="7" w:tplc="9EF8FC94">
+      <w:numFmt w:val="decimal"/>
+      <w:lvlText w:val=""/>
+      <w:lvlJc w:val="left"/>
+    </w:lvl>
+    <w:lvl w:ilvl="8" w:tplc="863E9DFC">
+      <w:numFmt w:val="decimal"/>
+      <w:lvlText w:val=""/>
+      <w:lvlJc w:val="left"/>
+    </w:lvl>
+  </w:abstractNum>
+  <w:abstractNum w:abstractNumId="2" w15:restartNumberingAfterBreak="0">
+    <w:nsid w:val="70CC1F8C"/>
+    <w:multiLevelType w:val="hybridMultilevel"/>
+    <w:tmpl w:val="3B1CF072"/>
+    <w:lvl w:ilvl="0" w:tplc="C9DED1B4" w:tentative="1">
       <w:start w:val="1"/>
       <w:numFmt w:val="bullet"/>
       <w:lvlText w:val="●"/>
@@ -16879,7 +17070,7 @@
         <w:ind w:left="720" w:hanging="360"/>
       </w:pPr>
     </w:lvl>
-    <w:lvl w:ilvl="1" w:tplc="95A8EDEC" w:tentative="1">
+    <w:lvl w:ilvl="1" w:tplc="7D580816" w:tentative="1">
       <w:start w:val="1"/>
       <w:numFmt w:val="bullet"/>
       <w:lvlText w:val="○"/>
@@ -16888,7 +17079,7 @@
         <w:ind w:left="1440" w:hanging="360"/>
       </w:pPr>
     </w:lvl>
-    <w:lvl w:ilvl="2" w:tplc="3BC6ACB0" w:tentative="1">
+    <w:lvl w:ilvl="2" w:tplc="A6CC4AA4" w:tentative="1">
       <w:start w:val="1"/>
       <w:numFmt w:val="bullet"/>
       <w:lvlText w:val="■"/>
@@ -16897,7 +17088,7 @@
         <w:ind w:left="2160" w:hanging="360"/>
       </w:pPr>
     </w:lvl>
-    <w:lvl w:ilvl="3" w:tplc="547ED4B4" w:tentative="1">
+    <w:lvl w:ilvl="3" w:tplc="EAF2F1C6" w:tentative="1">
       <w:start w:val="1"/>
       <w:numFmt w:val="bullet"/>
       <w:lvlText w:val="●"/>
@@ -16906,7 +17097,7 @@
         <w:ind w:left="2880" w:hanging="360"/>
       </w:pPr>
     </w:lvl>
-    <w:lvl w:ilvl="4" w:tplc="B18CFB8E" w:tentative="1">
+    <w:lvl w:ilvl="4" w:tplc="BA1C59EC" w:tentative="1">
       <w:start w:val="1"/>
       <w:numFmt w:val="bullet"/>
       <w:lvlText w:val="○"/>
@@ -16915,7 +17106,7 @@
         <w:ind w:left="3600" w:hanging="360"/>
       </w:pPr>
     </w:lvl>
-    <w:lvl w:ilvl="5" w:tplc="0AE69424" w:tentative="1">
+    <w:lvl w:ilvl="5" w:tplc="0740971A" w:tentative="1">
       <w:start w:val="1"/>
       <w:numFmt w:val="bullet"/>
       <w:lvlText w:val="■"/>
@@ -16924,7 +17115,7 @@
         <w:ind w:left="4320" w:hanging="360"/>
       </w:pPr>
     </w:lvl>
-    <w:lvl w:ilvl="6" w:tplc="CC22BDD4" w:tentative="1">
+    <w:lvl w:ilvl="6" w:tplc="321CE502" w:tentative="1">
       <w:start w:val="1"/>
       <w:numFmt w:val="bullet"/>
       <w:lvlText w:val="●"/>
@@ -16933,7 +17124,7 @@
         <w:ind w:left="5040" w:hanging="360"/>
       </w:pPr>
     </w:lvl>
-    <w:lvl w:ilvl="7" w:tplc="214834E4" w:tentative="1">
+    <w:lvl w:ilvl="7" w:tplc="1E56333E" w:tentative="1">
       <w:start w:val="1"/>
       <w:numFmt w:val="bullet"/>
       <w:lvlText w:val="●"/>
@@ -16942,7 +17133,7 @@
         <w:ind w:left="5760" w:hanging="360"/>
       </w:pPr>
     </w:lvl>
-    <w:lvl w:ilvl="8" w:tplc="704CAF52" w:tentative="1">
+    <w:lvl w:ilvl="8" w:tplc="20A6F0F0" w:tentative="1">
       <w:start w:val="1"/>
       <w:numFmt w:val="bullet"/>
       <w:lvlText w:val="●"/>
@@ -16952,124 +17143,62 @@
       </w:pPr>
     </w:lvl>
   </w:abstractNum>
-  <w:abstractNum w:abstractNumId="2" w15:restartNumberingAfterBreak="0">
-    <w:nsid w:val="5A361371"/>
-    <w:multiLevelType w:val="hybridMultilevel"/>
-    <w:tmpl w:val="17067F76"/>
-    <w:lvl w:ilvl="0" w:tplc="6F7E9E08">
-      <w:start w:val="1"/>
-      <w:numFmt w:val="bullet"/>
-      <w:lvlText w:val="•"/>
-      <w:lvlJc w:val="left"/>
-      <w:pPr>
-        <w:ind w:left="720" w:hanging="280"/>
-      </w:pPr>
-    </w:lvl>
-    <w:lvl w:ilvl="1" w:tplc="3C2E140C" w:tentative="1">
-      <w:start w:val="1"/>
-      <w:numFmt w:val="bullet"/>
-      <w:lvlText w:val="–"/>
-      <w:lvlJc w:val="left"/>
-      <w:pPr>
-        <w:ind w:left="1080" w:hanging="280"/>
-      </w:pPr>
-    </w:lvl>
-    <w:lvl w:ilvl="2" w:tplc="660A2E56" w:tentative="1">
-      <w:start w:val="1"/>
-      <w:numFmt w:val="bullet"/>
-      <w:lvlText w:val="▪"/>
-      <w:lvlJc w:val="left"/>
-      <w:pPr>
-        <w:ind w:left="1440" w:hanging="280"/>
-      </w:pPr>
-    </w:lvl>
-    <w:lvl w:ilvl="3" w:tplc="EB78059C">
-      <w:numFmt w:val="decimal"/>
-      <w:lvlText w:val=""/>
-      <w:lvlJc w:val="left"/>
-    </w:lvl>
-    <w:lvl w:ilvl="4" w:tplc="A3324BA8">
-      <w:numFmt w:val="decimal"/>
-      <w:lvlText w:val=""/>
-      <w:lvlJc w:val="left"/>
-    </w:lvl>
-    <w:lvl w:ilvl="5" w:tplc="CA56CF32">
-      <w:numFmt w:val="decimal"/>
-      <w:lvlText w:val=""/>
-      <w:lvlJc w:val="left"/>
-    </w:lvl>
-    <w:lvl w:ilvl="6" w:tplc="3DEC0DD4">
-      <w:numFmt w:val="decimal"/>
-      <w:lvlText w:val=""/>
-      <w:lvlJc w:val="left"/>
-    </w:lvl>
-    <w:lvl w:ilvl="7" w:tplc="C19AC07E">
-      <w:numFmt w:val="decimal"/>
-      <w:lvlText w:val=""/>
-      <w:lvlJc w:val="left"/>
-    </w:lvl>
-    <w:lvl w:ilvl="8" w:tplc="43DE32A6">
-      <w:numFmt w:val="decimal"/>
-      <w:lvlText w:val=""/>
-      <w:lvlJc w:val="left"/>
-    </w:lvl>
-  </w:abstractNum>
-  <w:num w:numId="1" w16cid:durableId="272515301">
+  <w:num w:numId="1" w16cid:durableId="686519782">
+    <w:abstractNumId w:val="2"/>
+    <w:lvlOverride w:ilvl="0">
+      <w:startOverride w:val="1"/>
+    </w:lvlOverride>
+  </w:num>
+  <w:num w:numId="2" w16cid:durableId="1814103584">
     <w:abstractNumId w:val="1"/>
     <w:lvlOverride w:ilvl="0">
       <w:startOverride w:val="1"/>
     </w:lvlOverride>
   </w:num>
-  <w:num w:numId="2" w16cid:durableId="153687973">
-    <w:abstractNumId w:val="2"/>
+  <w:num w:numId="3" w16cid:durableId="797643305">
+    <w:abstractNumId w:val="1"/>
     <w:lvlOverride w:ilvl="0">
       <w:startOverride w:val="1"/>
     </w:lvlOverride>
   </w:num>
-  <w:num w:numId="3" w16cid:durableId="353581015">
-    <w:abstractNumId w:val="2"/>
-    <w:lvlOverride w:ilvl="0">
-      <w:startOverride w:val="1"/>
-    </w:lvlOverride>
-  </w:num>
-  <w:num w:numId="4" w16cid:durableId="1818645946">
+  <w:num w:numId="4" w16cid:durableId="778184059">
     <w:abstractNumId w:val="0"/>
     <w:lvlOverride w:ilvl="0">
       <w:startOverride w:val="1"/>
     </w:lvlOverride>
   </w:num>
-  <w:num w:numId="5" w16cid:durableId="685137337">
-    <w:abstractNumId w:val="2"/>
+  <w:num w:numId="5" w16cid:durableId="1179614089">
+    <w:abstractNumId w:val="1"/>
     <w:lvlOverride w:ilvl="0">
       <w:startOverride w:val="1"/>
     </w:lvlOverride>
   </w:num>
-  <w:num w:numId="6" w16cid:durableId="717052432">
+  <w:num w:numId="6" w16cid:durableId="1543983727">
     <w:abstractNumId w:val="0"/>
     <w:lvlOverride w:ilvl="0">
       <w:startOverride w:val="1"/>
     </w:lvlOverride>
   </w:num>
-  <w:num w:numId="7" w16cid:durableId="489256104">
-    <w:abstractNumId w:val="2"/>
+  <w:num w:numId="7" w16cid:durableId="1950163015">
+    <w:abstractNumId w:val="1"/>
     <w:lvlOverride w:ilvl="0">
       <w:startOverride w:val="1"/>
     </w:lvlOverride>
   </w:num>
-  <w:num w:numId="8" w16cid:durableId="115226031">
-    <w:abstractNumId w:val="2"/>
+  <w:num w:numId="8" w16cid:durableId="1059472764">
+    <w:abstractNumId w:val="1"/>
     <w:lvlOverride w:ilvl="0">
       <w:startOverride w:val="1"/>
     </w:lvlOverride>
   </w:num>
-  <w:num w:numId="9" w16cid:durableId="173497415">
-    <w:abstractNumId w:val="2"/>
+  <w:num w:numId="9" w16cid:durableId="1703897019">
+    <w:abstractNumId w:val="1"/>
     <w:lvlOverride w:ilvl="0">
       <w:startOverride w:val="1"/>
     </w:lvlOverride>
   </w:num>
-  <w:num w:numId="10" w16cid:durableId="58678945">
-    <w:abstractNumId w:val="2"/>
+  <w:num w:numId="10" w16cid:durableId="46270915">
+    <w:abstractNumId w:val="1"/>
     <w:lvlOverride w:ilvl="0">
       <w:startOverride w:val="1"/>
     </w:lvlOverride>
@@ -17773,7 +17902,7 @@
     <w:autoRedefine/>
     <w:uiPriority w:val="39"/>
     <w:unhideWhenUsed/>
-    <w:rsid w:val="00B82C03"/>
+    <w:rsid w:val="00996D25"/>
     <w:pPr>
       <w:spacing w:after="100"/>
     </w:pPr>
@@ -17785,7 +17914,7 @@
     <w:autoRedefine/>
     <w:uiPriority w:val="39"/>
     <w:unhideWhenUsed/>
-    <w:rsid w:val="00B82C03"/>
+    <w:rsid w:val="00996D25"/>
     <w:pPr>
       <w:spacing w:after="100"/>
       <w:ind w:left="210"/>
@@ -17797,7 +17926,7 @@
     <w:next w:val="Normal"/>
     <w:uiPriority w:val="99"/>
     <w:unhideWhenUsed/>
-    <w:rsid w:val="00B82C03"/>
+    <w:rsid w:val="00996D25"/>
   </w:style>
 </w:styles>
 </file>

</xml_diff>